<commit_message>
Update 개인PRD.docx content to match the shipped app
Refreshes the Q1/Q4/Q5 answers and the one-paragraph PRD to reflect
what was actually built: preset-only service selection (no custom
entry), the D-7~당일 notification threshold instead of fixed D-3/D-1,
and the in-app cancel/keep modal instead of a cancellation-page
redirect. Document template and unrelated sections (Q2, Q3, Q6)
are untouched.

Co-Authored-By: Claude Sonnet 5 <noreply@anthropic.com>
</commit_message>
<xml_diff>
--- a/docs/개인PRD.docx
+++ b/docs/개인PRD.docx
@@ -334,7 +334,7 @@
                 <w:szCs w:val="22"/>
                 <w:rtl w:val="0"/>
               </w:rPr>
-              <w:t xml:space="preserve">넷플릭스·유튜브 프리미엄·OTT·헬스장·정기배송 등 여러 구독 서비스를 동시에 이용 중이라, 매달 언제 얼마가 빠져나가는지 다 기억하지 못하는 20~30대 직장인</w:t>
+              <w:t>넷플릭스·유튜브 프리미엄·디즈니플러스·스포티파이·쿠팡 와우 등 여러 구독 서비스를 동시에 이용 중이라, 매달 언제 얼마가 빠져나가는지 다 기억하지 못하는 20~30대 직장인</w:t>
             </w:r>
             <w:r>
               <w:rPr>
@@ -1118,7 +1118,7 @@
                 <w:szCs w:val="22"/>
                 <w:rtl w:val="0"/>
               </w:rPr>
-              <w:t xml:space="preserve">① 구독 등록: 서비스명·결제금액·결제주기·다음 결제일 입력 (자주 쓰는 서비스는 목록에서 선택)</w:t>
+              <w:t>① 구독 등록: 자주 쓰는 서비스 10개 중 선택(브랜드 아이콘 표시) 후 결제금액·결제주기·다음 결제일 입력</w:t>
             </w:r>
           </w:p>
           <w:p>
@@ -1138,7 +1138,7 @@
                 <w:szCs w:val="22"/>
                 <w:rtl w:val="0"/>
               </w:rPr>
-              <w:t xml:space="preserve">② 갱신일 알림: 결제 D-3일·D-1일 알림 발송, 알림에서 바로 해지 여부 선택 유도</w:t>
+              <w:t>② 갱신일 알림: 원하는 알림 시점(D-7~당일 중 선택)에 결제 예정 목록에 노출, 클릭 시 바로 해지 여부 선택 유도</w:t>
             </w:r>
           </w:p>
           <w:p>
@@ -1156,7 +1156,7 @@
                 <w:szCs w:val="22"/>
                 <w:rtl w:val="0"/>
               </w:rPr>
-              <w:t xml:space="preserve">③ 지출 대시보드: 이번 달 총 구독 지출액과 서비스별 비중을 한눈에 시각화</w:t>
+              <w:t>③ 지출 대시보드: 이번 달 총 구독 지출액(연간 환산 포함)과 서비스별 비중을 한눈에 시각화</w:t>
             </w:r>
             <w:r>
               <w:rPr>
@@ -1403,7 +1403,7 @@
                 <w:szCs w:val="22"/>
                 <w:rtl w:val="0"/>
               </w:rPr>
-              <w:t xml:space="preserve">[화면 1 - 구독 등록] 서비스 검색/선택 또는 직접 입력 / 결제금액·결제주기(매월·매년) 입력 / 다음 결제일 선택 / [등록] 버튼</w:t>
+              <w:t>[화면 1 - 구독 등록] 서비스 목록에서 선택(브랜드 아이콘 표시) / 결제금액·결제주기(매월·매년) 입력 / 다음 결제일 선택 / [등록] 버튼</w:t>
             </w:r>
           </w:p>
           <w:p>
@@ -1424,7 +1424,7 @@
                 <w:szCs w:val="22"/>
                 <w:rtl w:val="0"/>
               </w:rPr>
-              <w:t xml:space="preserve">[화면 2 - 홈/대시보드] 상단에 이번 달 총 구독 지출액 표시 / 구독 목록(로고·이름·다음 결제일·금액) / 곧 결제 예정인 항목 상단 강조 표시</w:t>
+              <w:t>[화면 2 - 홈/대시보드] 상단에 이번 달 총 구독 지출액(연간 환산 포함) 표시 / 구독 목록(아이콘·이름·다음 결제일·금액, 결제일이 가까운 순으로 정렬) / D-day 배지로 곧 결제 예정인 항목 표시</w:t>
             </w:r>
           </w:p>
           <w:p>
@@ -1441,291 +1441,7 @@
                 <w:szCs w:val="22"/>
                 <w:rtl w:val="0"/>
               </w:rPr>
-              <w:t xml:space="preserve">[</w:t>
-            </w:r>
-            <w:r>
-              <w:rPr>
-                <w:rFonts w:ascii="Malgun Gothic" w:cs="Malgun Gothic" w:eastAsia="Malgun Gothic" w:hAnsi="Malgun Gothic"/>
-                <w:color w:val="111111"/>
-                <w:sz w:val="22"/>
-                <w:szCs w:val="22"/>
-                <w:rtl w:val="0"/>
-              </w:rPr>
-              <w:t xml:space="preserve">화면</w:t>
-            </w:r>
-            <w:r>
-              <w:rPr>
-                <w:color w:val="111111"/>
-                <w:sz w:val="22"/>
-                <w:szCs w:val="22"/>
-                <w:rtl w:val="0"/>
-              </w:rPr>
-              <w:t xml:space="preserve"> 3 - </w:t>
-            </w:r>
-            <w:r>
-              <w:rPr>
-                <w:rFonts w:ascii="Malgun Gothic" w:cs="Malgun Gothic" w:eastAsia="Malgun Gothic" w:hAnsi="Malgun Gothic"/>
-                <w:color w:val="111111"/>
-                <w:sz w:val="22"/>
-                <w:szCs w:val="22"/>
-                <w:rtl w:val="0"/>
-              </w:rPr>
-              <w:t xml:space="preserve">알림</w:t>
-            </w:r>
-            <w:r>
-              <w:rPr>
-                <w:color w:val="111111"/>
-                <w:sz w:val="22"/>
-                <w:szCs w:val="22"/>
-                <w:rtl w:val="0"/>
-              </w:rPr>
-              <w:t xml:space="preserve">] </w:t>
-            </w:r>
-            <w:r>
-              <w:rPr>
-                <w:rFonts w:ascii="Malgun Gothic" w:cs="Malgun Gothic" w:eastAsia="Malgun Gothic" w:hAnsi="Malgun Gothic"/>
-                <w:color w:val="111111"/>
-                <w:sz w:val="22"/>
-                <w:szCs w:val="22"/>
-                <w:rtl w:val="0"/>
-              </w:rPr>
-              <w:t xml:space="preserve">결제</w:t>
-            </w:r>
-            <w:r>
-              <w:rPr>
-                <w:color w:val="111111"/>
-                <w:sz w:val="22"/>
-                <w:szCs w:val="22"/>
-                <w:rtl w:val="0"/>
-              </w:rPr>
-              <w:t xml:space="preserve"> D-3·D-1·</w:t>
-            </w:r>
-            <w:r>
-              <w:rPr>
-                <w:rFonts w:ascii="Malgun Gothic" w:cs="Malgun Gothic" w:eastAsia="Malgun Gothic" w:hAnsi="Malgun Gothic"/>
-                <w:color w:val="111111"/>
-                <w:sz w:val="22"/>
-                <w:szCs w:val="22"/>
-                <w:rtl w:val="0"/>
-              </w:rPr>
-              <w:t xml:space="preserve">당일</w:t>
-            </w:r>
-            <w:r>
-              <w:rPr>
-                <w:color w:val="111111"/>
-                <w:sz w:val="22"/>
-                <w:szCs w:val="22"/>
-                <w:rtl w:val="0"/>
-              </w:rPr>
-              <w:t xml:space="preserve"> </w:t>
-            </w:r>
-            <w:r>
-              <w:rPr>
-                <w:rFonts w:ascii="Malgun Gothic" w:cs="Malgun Gothic" w:eastAsia="Malgun Gothic" w:hAnsi="Malgun Gothic"/>
-                <w:color w:val="111111"/>
-                <w:sz w:val="22"/>
-                <w:szCs w:val="22"/>
-                <w:rtl w:val="0"/>
-              </w:rPr>
-              <w:t xml:space="preserve">알림</w:t>
-            </w:r>
-            <w:r>
-              <w:rPr>
-                <w:color w:val="111111"/>
-                <w:sz w:val="22"/>
-                <w:szCs w:val="22"/>
-                <w:rtl w:val="0"/>
-              </w:rPr>
-              <w:t xml:space="preserve"> </w:t>
-            </w:r>
-            <w:r>
-              <w:rPr>
-                <w:rFonts w:ascii="Malgun Gothic" w:cs="Malgun Gothic" w:eastAsia="Malgun Gothic" w:hAnsi="Malgun Gothic"/>
-                <w:color w:val="111111"/>
-                <w:sz w:val="22"/>
-                <w:szCs w:val="22"/>
-                <w:rtl w:val="0"/>
-              </w:rPr>
-              <w:t xml:space="preserve">목록</w:t>
-            </w:r>
-            <w:r>
-              <w:rPr>
-                <w:color w:val="111111"/>
-                <w:sz w:val="22"/>
-                <w:szCs w:val="22"/>
-                <w:rtl w:val="0"/>
-              </w:rPr>
-              <w:t xml:space="preserve"> / </w:t>
-            </w:r>
-            <w:r>
-              <w:rPr>
-                <w:rFonts w:ascii="Malgun Gothic" w:cs="Malgun Gothic" w:eastAsia="Malgun Gothic" w:hAnsi="Malgun Gothic"/>
-                <w:color w:val="111111"/>
-                <w:sz w:val="22"/>
-                <w:szCs w:val="22"/>
-                <w:rtl w:val="0"/>
-              </w:rPr>
-              <w:t xml:space="preserve">알림</w:t>
-            </w:r>
-            <w:r>
-              <w:rPr>
-                <w:color w:val="111111"/>
-                <w:sz w:val="22"/>
-                <w:szCs w:val="22"/>
-                <w:rtl w:val="0"/>
-              </w:rPr>
-              <w:t xml:space="preserve"> </w:t>
-            </w:r>
-            <w:r>
-              <w:rPr>
-                <w:rFonts w:ascii="Malgun Gothic" w:cs="Malgun Gothic" w:eastAsia="Malgun Gothic" w:hAnsi="Malgun Gothic"/>
-                <w:color w:val="111111"/>
-                <w:sz w:val="22"/>
-                <w:szCs w:val="22"/>
-                <w:rtl w:val="0"/>
-              </w:rPr>
-              <w:t xml:space="preserve">클릭</w:t>
-            </w:r>
-            <w:r>
-              <w:rPr>
-                <w:color w:val="111111"/>
-                <w:sz w:val="22"/>
-                <w:szCs w:val="22"/>
-                <w:rtl w:val="0"/>
-              </w:rPr>
-              <w:t xml:space="preserve"> </w:t>
-            </w:r>
-            <w:r>
-              <w:rPr>
-                <w:rFonts w:ascii="Malgun Gothic" w:cs="Malgun Gothic" w:eastAsia="Malgun Gothic" w:hAnsi="Malgun Gothic"/>
-                <w:color w:val="111111"/>
-                <w:sz w:val="22"/>
-                <w:szCs w:val="22"/>
-                <w:rtl w:val="0"/>
-              </w:rPr>
-              <w:t xml:space="preserve">시</w:t>
-            </w:r>
-            <w:r>
-              <w:rPr>
-                <w:color w:val="111111"/>
-                <w:sz w:val="22"/>
-                <w:szCs w:val="22"/>
-                <w:rtl w:val="0"/>
-              </w:rPr>
-              <w:t xml:space="preserve"> [</w:t>
-            </w:r>
-            <w:r>
-              <w:rPr>
-                <w:rFonts w:ascii="Malgun Gothic" w:cs="Malgun Gothic" w:eastAsia="Malgun Gothic" w:hAnsi="Malgun Gothic"/>
-                <w:color w:val="111111"/>
-                <w:sz w:val="22"/>
-                <w:szCs w:val="22"/>
-                <w:rtl w:val="0"/>
-              </w:rPr>
-              <w:t xml:space="preserve">구독</w:t>
-            </w:r>
-            <w:r>
-              <w:rPr>
-                <w:color w:val="111111"/>
-                <w:sz w:val="22"/>
-                <w:szCs w:val="22"/>
-                <w:rtl w:val="0"/>
-              </w:rPr>
-              <w:t xml:space="preserve"> </w:t>
-            </w:r>
-            <w:r>
-              <w:rPr>
-                <w:rFonts w:ascii="Malgun Gothic" w:cs="Malgun Gothic" w:eastAsia="Malgun Gothic" w:hAnsi="Malgun Gothic"/>
-                <w:color w:val="111111"/>
-                <w:sz w:val="22"/>
-                <w:szCs w:val="22"/>
-                <w:rtl w:val="0"/>
-              </w:rPr>
-              <w:t xml:space="preserve">유지</w:t>
-            </w:r>
-            <w:r>
-              <w:rPr>
-                <w:color w:val="111111"/>
-                <w:sz w:val="22"/>
-                <w:szCs w:val="22"/>
-                <w:rtl w:val="0"/>
-              </w:rPr>
-              <w:t xml:space="preserve">] / [</w:t>
-            </w:r>
-            <w:r>
-              <w:rPr>
-                <w:rFonts w:ascii="Malgun Gothic" w:cs="Malgun Gothic" w:eastAsia="Malgun Gothic" w:hAnsi="Malgun Gothic"/>
-                <w:color w:val="111111"/>
-                <w:sz w:val="22"/>
-                <w:szCs w:val="22"/>
-                <w:rtl w:val="0"/>
-              </w:rPr>
-              <w:t xml:space="preserve">해지</w:t>
-            </w:r>
-            <w:r>
-              <w:rPr>
-                <w:color w:val="111111"/>
-                <w:sz w:val="22"/>
-                <w:szCs w:val="22"/>
-                <w:rtl w:val="0"/>
-              </w:rPr>
-              <w:t xml:space="preserve"> </w:t>
-            </w:r>
-            <w:r>
-              <w:rPr>
-                <w:rFonts w:ascii="Malgun Gothic" w:cs="Malgun Gothic" w:eastAsia="Malgun Gothic" w:hAnsi="Malgun Gothic"/>
-                <w:color w:val="111111"/>
-                <w:sz w:val="22"/>
-                <w:szCs w:val="22"/>
-                <w:rtl w:val="0"/>
-              </w:rPr>
-              <w:t xml:space="preserve">페이지로</w:t>
-            </w:r>
-            <w:r>
-              <w:rPr>
-                <w:color w:val="111111"/>
-                <w:sz w:val="22"/>
-                <w:szCs w:val="22"/>
-                <w:rtl w:val="0"/>
-              </w:rPr>
-              <w:t xml:space="preserve"> </w:t>
-            </w:r>
-            <w:r>
-              <w:rPr>
-                <w:rFonts w:ascii="Malgun Gothic" w:cs="Malgun Gothic" w:eastAsia="Malgun Gothic" w:hAnsi="Malgun Gothic"/>
-                <w:color w:val="111111"/>
-                <w:sz w:val="22"/>
-                <w:szCs w:val="22"/>
-                <w:rtl w:val="0"/>
-              </w:rPr>
-              <w:t xml:space="preserve">이동</w:t>
-            </w:r>
-            <w:r>
-              <w:rPr>
-                <w:color w:val="111111"/>
-                <w:sz w:val="22"/>
-                <w:szCs w:val="22"/>
-                <w:rtl w:val="0"/>
-              </w:rPr>
-              <w:t xml:space="preserve">] </w:t>
-            </w:r>
-            <w:r>
-              <w:rPr>
-                <w:rFonts w:ascii="Malgun Gothic" w:cs="Malgun Gothic" w:eastAsia="Malgun Gothic" w:hAnsi="Malgun Gothic"/>
-                <w:color w:val="111111"/>
-                <w:sz w:val="22"/>
-                <w:szCs w:val="22"/>
-                <w:rtl w:val="0"/>
-              </w:rPr>
-              <w:t xml:space="preserve">버튼</w:t>
-            </w:r>
-            <w:r>
-              <w:rPr>
-                <w:rFonts w:ascii="Malgun Gothic" w:cs="Malgun Gothic" w:eastAsia="Malgun Gothic" w:hAnsi="Malgun Gothic"/>
-                <w:color w:val="1a1a2e"/>
-                <w:rtl w:val="0"/>
-              </w:rPr>
-              <w:t xml:space="preserve"> </w:t>
+              <w:t xml:space="preserve">[화면 3 - 알림] 원하는 알림 시점(D-7~당일)에 맞춰 결제 예정 목록 표시 / 항목 클릭 시 [해지] / [구독 유지] 버튼 </w:t>
             </w:r>
           </w:p>
           <w:p>
@@ -2297,7 +2013,7 @@
                 <w:szCs w:val="22"/>
                 <w:rtl w:val="0"/>
               </w:rPr>
-              <w:t xml:space="preserve">넷플릭스·유튜브 프리미엄·헬스장·정기배송 등 여러 구독 서비스를 동시에 이용하는 20~30대 직장인은, 각기 다른 날짜에 자동결제되는 구독료를 다 기억하지 못해 불필요한 지출을 반복하고, 해지하려 해도 갱신일을 놓쳐 타이밍을 잡지 못한다. 이를 해결하기 위해, 구독 정보를 등록하면 갱신일 전에 알림을 보내고 전체 지출 현황을 한눈에 보여주는 앱을 만든다. 핵심 기능은 세 가지로, ① 서비스명·결제금액·결제주기·다음 결제일을 입력해 구독을 등록하고, ② 결제 D-3일·D-1일에 알림을 보내 해지 여부를 바로 선택하게 하며, ③ 이번 달 총 구독 지출액과 서비스별 비중을 대시보드로 시각화한다. 화면은 구독 등록 → 홈/대시보드 확인 → 알림 확인 및 해지 선택 순으로 구성된다. 알림을 받은 사용자 중 실제로 불필요한 구독을 해지하는 비율이 30% 이상이고, 앱 등록 4주 후에도 재방문하는 사용자 비율이 40% 이상이면 성공으로 본다.</w:t>
+              <w:t>넷플릭스·유튜브 프리미엄·디즈니플러스·스포티파이 등 여러 구독 서비스를 동시에 이용하는 20~30대 직장인은, 각기 다른 날짜에 자동결제되는 구독료를 다 기억하지 못해 불필요한 지출을 반복하고, 해지하려 해도 갱신일을 놓쳐 타이밍을 잡지 못한다. 이를 해결하기 위해, 구독 정보를 등록하면 갱신일 전에 알림을 보내고 전체 지출 현황을 한눈에 보여주는 앱을 만든다. 핵심 기능은 세 가지로, ① 자주 쓰는 서비스 목록에서 선택해 결제금액·결제주기·다음 결제일을 입력해 구독을 등록하고, ② 원하는 알림 시점(D-7~당일)에 알림을 보내 해지 여부를 바로 선택하게 하며, ③ 이번 달 총 구독 지출액(연간 환산 포함)과 서비스별 비중을 대시보드로 시각화한다. 화면은 구독 등록 → 홈/대시보드 확인 → 알림 확인 및 해지 선택 순으로 구성된다. 알림을 받은 사용자 중 실제로 불필요한 구독을 해지하는 비율이 30% 이상이고, 앱 등록 4주 후에도 재방문하는 사용자 비율이 40% 이상이면 성공으로 본다.</w:t>
             </w:r>
             <w:r>
               <w:rPr>

</xml_diff>